<commit_message>
sop(all): rename MTR-Q to MetriQ
Product name across sales, marketing, mechanical, software and business docs;
mechanical/mtr-q-rig -> mechanical/metriq-rig; attachments renamed to
metriq-ai-box-bom.xlsx and metriq-cost-model.xlsx; proposal and task files
regenerated. Brand rules list MTR-Q as an old name never to use.

Co-Authored-By: Claude Opus 5.5 <noreply@anthropic.com>
Claude-Session: https://claude.ai/code/session_01Ncff43TqFQezx4LvhHWdqB
</commit_message>
<xml_diff>
--- a/content/business/attachments/business-proposal.docx
+++ b/content/business/attachments/business-proposal.docx
@@ -77,7 +77,7 @@
           <w:sz w:val="24"/>
           <w:szCs w:val="24"/>
         </w:rPr>
-        <w:t xml:space="preserve">Pitch and bank-loan proposal for MTR-Q — problem, product, market, prices, costs, timeline and funding ask.</w:t>
+        <w:t xml:space="preserve">Pitch and bank-loan proposal for MetriQ — problem, product, market, prices, costs, timeline and funding ask.</w:t>
       </w:r>
     </w:p>
     <w:p>
@@ -165,7 +165,7 @@
         <w:rPr>
           <w:rFonts w:ascii="Arial" w:cs="Arial" w:eastAsia="Arial" w:hAnsi="Arial"/>
         </w:rPr>
-        <w:t xml:space="preserve">MTRobotics builds MTR-Q: a camera inspection station that sits on an existing production line and removes bad products automatically. It finds new defect types without weeks of photo collection and model training (zero-shot detection), and it is installed in hours, without stopping the line.</w:t>
+        <w:t xml:space="preserve">MTRobotics builds MetriQ: a camera inspection station that sits on an existing production line and removes bad products automatically. It finds new defect types without weeks of photo collection and model training (zero-shot detection), and it is installed in hours, without stopping the line.</w:t>
       </w:r>
     </w:p>
     <w:p>
@@ -195,7 +195,7 @@
         <w:rPr>
           <w:rFonts w:ascii="Arial" w:cs="Arial" w:eastAsia="Arial" w:hAnsi="Arial"/>
         </w:rPr>
-        <w:t xml:space="preserve"> to build stock for 10 units, two demo stations, and the first paid installations. Each MTR-Q sold at the proposed price returns about </w:t>
+        <w:t xml:space="preserve"> to build stock for 10 units, two demo stations, and the first paid installations. Each MetriQ sold at the proposed price returns about </w:t>
       </w:r>
       <w:r>
         <w:rPr>
@@ -363,7 +363,7 @@
                 <w:sz w:val="18"/>
                 <w:szCs w:val="18"/>
               </w:rPr>
-              <w:t xml:space="preserve">MTR-Q AI inspection station (live)</w:t>
+              <w:t xml:space="preserve">MetriQ AI inspection station (live)</w:t>
             </w:r>
           </w:p>
         </w:tc>
@@ -911,7 +911,7 @@
         <w:rPr>
           <w:rFonts w:ascii="Arial" w:cs="Arial" w:eastAsia="Arial" w:hAnsi="Arial"/>
         </w:rPr>
-        <w:t xml:space="preserve">MTR-Q is a complete inspection station: camera, lighting, edge computer, software and reject output, delivered and installed by one team.</w:t>
+        <w:t xml:space="preserve">MetriQ is a complete inspection station: camera, lighting, edge computer, software and reject output, delivered and installed by one team.</w:t>
       </w:r>
     </w:p>
     <w:p>
@@ -943,7 +943,7 @@
         <w:rPr>
           <w:rFonts w:ascii="Arial" w:cs="Arial" w:eastAsia="Arial" w:hAnsi="Arial"/>
         </w:rPr>
-        <w:t xml:space="preserve">Tell MTR-Q what a defect looks like. It starts finding it the same day.</w:t>
+        <w:t xml:space="preserve">Tell MetriQ what a defect looks like. It starts finding it the same day.</w:t>
       </w:r>
     </w:p>
     <w:p>
@@ -959,7 +959,7 @@
         <w:rPr>
           <w:rFonts w:ascii="Arial" w:cs="Arial" w:eastAsia="Arial" w:hAnsi="Arial"/>
         </w:rPr>
-        <w:t xml:space="preserve">MTR-Q checks every product in real time and signals the reject system to remove bad ones.</w:t>
+        <w:t xml:space="preserve">MetriQ checks every product in real time and signals the reject system to remove bad ones.</w:t>
       </w:r>
     </w:p>
     <w:p>
@@ -1189,7 +1189,7 @@
                 <w:sz w:val="18"/>
                 <w:szCs w:val="18"/>
               </w:rPr>
-              <w:t xml:space="preserve">MTR-Q</w:t>
+              <w:t xml:space="preserve">MetriQ</w:t>
             </w:r>
           </w:p>
         </w:tc>
@@ -3061,7 +3061,7 @@
                 <w:sz w:val="18"/>
                 <w:szCs w:val="18"/>
               </w:rPr>
-              <w:t xml:space="preserve">MTR-Q Pro</w:t>
+              <w:t xml:space="preserve">MetriQ Pro</w:t>
             </w:r>
           </w:p>
         </w:tc>
@@ -3187,7 +3187,7 @@
                 <w:sz w:val="18"/>
                 <w:szCs w:val="18"/>
               </w:rPr>
-              <w:t xml:space="preserve">MTR-Q Lite</w:t>
+              <w:t xml:space="preserve">MetriQ Lite</w:t>
             </w:r>
           </w:p>
         </w:tc>
@@ -3797,7 +3797,7 @@
         <w:rPr>
           <w:rFonts w:ascii="Arial" w:cs="Arial" w:eastAsia="Arial" w:hAnsi="Arial"/>
         </w:rPr>
-        <w:t xml:space="preserve">Market reference: entry-level AI inspection USD 3,000–10,000 (software or camera only), mid-range USD 50,000–150,000 plus installation. MTR-Q is a complete installed station priced near the entry level.</w:t>
+        <w:t xml:space="preserve">Market reference: entry-level AI inspection USD 3,000–10,000 (software or camera only), mid-range USD 50,000–150,000 plus installation. MetriQ is a complete installed station priced near the entry level.</w:t>
       </w:r>
     </w:p>
     <w:p>
@@ -3832,9 +3832,9 @@
         </w:tblBorders>
       </w:tblPr>
       <w:tblGrid>
-        <w:gridCol w:w="5731"/>
-        <w:gridCol w:w="1719"/>
-        <w:gridCol w:w="1910"/>
+        <w:gridCol w:w="5506"/>
+        <w:gridCol w:w="1835"/>
+        <w:gridCol w:w="2019"/>
       </w:tblGrid>
       <w:tr>
         <w:trPr>
@@ -3843,7 +3843,7 @@
         </w:trPr>
         <w:tc>
           <w:tcPr>
-            <w:tcW w:type="dxa" w:w="5731"/>
+            <w:tcW w:type="dxa" w:w="5506"/>
             <w:tcBorders>
               <w:top w:val="single" w:color="D9D7D0" w:sz="4"/>
               <w:left w:val="single" w:color="D9D7D0" w:sz="4"/>
@@ -3877,7 +3877,7 @@
         </w:tc>
         <w:tc>
           <w:tcPr>
-            <w:tcW w:type="dxa" w:w="1719"/>
+            <w:tcW w:type="dxa" w:w="1835"/>
             <w:tcBorders>
               <w:top w:val="single" w:color="D9D7D0" w:sz="4"/>
               <w:left w:val="single" w:color="D9D7D0" w:sz="4"/>
@@ -3905,13 +3905,13 @@
                 <w:sz w:val="18"/>
                 <w:szCs w:val="18"/>
               </w:rPr>
-              <w:t xml:space="preserve">MTR-Q Pro</w:t>
-            </w:r>
-          </w:p>
-        </w:tc>
-        <w:tc>
-          <w:tcPr>
-            <w:tcW w:type="dxa" w:w="1910"/>
+              <w:t xml:space="preserve">MetriQ Pro</w:t>
+            </w:r>
+          </w:p>
+        </w:tc>
+        <w:tc>
+          <w:tcPr>
+            <w:tcW w:type="dxa" w:w="2019"/>
             <w:tcBorders>
               <w:top w:val="single" w:color="D9D7D0" w:sz="4"/>
               <w:left w:val="single" w:color="D9D7D0" w:sz="4"/>
@@ -3939,7 +3939,7 @@
                 <w:sz w:val="18"/>
                 <w:szCs w:val="18"/>
               </w:rPr>
-              <w:t xml:space="preserve">MTR-Q Lite</w:t>
+              <w:t xml:space="preserve">MetriQ Lite</w:t>
             </w:r>
           </w:p>
         </w:tc>
@@ -3951,7 +3951,7 @@
         </w:trPr>
         <w:tc>
           <w:tcPr>
-            <w:tcW w:type="dxa" w:w="5731"/>
+            <w:tcW w:type="dxa" w:w="5506"/>
             <w:tcBorders>
               <w:top w:val="single" w:color="D9D7D0" w:sz="4"/>
               <w:left w:val="single" w:color="D9D7D0" w:sz="4"/>
@@ -3981,7 +3981,7 @@
         </w:tc>
         <w:tc>
           <w:tcPr>
-            <w:tcW w:type="dxa" w:w="1719"/>
+            <w:tcW w:type="dxa" w:w="1835"/>
             <w:tcBorders>
               <w:top w:val="single" w:color="D9D7D0" w:sz="4"/>
               <w:left w:val="single" w:color="D9D7D0" w:sz="4"/>
@@ -4011,7 +4011,7 @@
         </w:tc>
         <w:tc>
           <w:tcPr>
-            <w:tcW w:type="dxa" w:w="1910"/>
+            <w:tcW w:type="dxa" w:w="2019"/>
             <w:tcBorders>
               <w:top w:val="single" w:color="D9D7D0" w:sz="4"/>
               <w:left w:val="single" w:color="D9D7D0" w:sz="4"/>
@@ -4047,7 +4047,7 @@
         </w:trPr>
         <w:tc>
           <w:tcPr>
-            <w:tcW w:type="dxa" w:w="5731"/>
+            <w:tcW w:type="dxa" w:w="5506"/>
             <w:tcBorders>
               <w:top w:val="single" w:color="D9D7D0" w:sz="4"/>
               <w:left w:val="single" w:color="D9D7D0" w:sz="4"/>
@@ -4077,7 +4077,7 @@
         </w:tc>
         <w:tc>
           <w:tcPr>
-            <w:tcW w:type="dxa" w:w="1719"/>
+            <w:tcW w:type="dxa" w:w="1835"/>
             <w:tcBorders>
               <w:top w:val="single" w:color="D9D7D0" w:sz="4"/>
               <w:left w:val="single" w:color="D9D7D0" w:sz="4"/>
@@ -4107,7 +4107,7 @@
         </w:tc>
         <w:tc>
           <w:tcPr>
-            <w:tcW w:type="dxa" w:w="1910"/>
+            <w:tcW w:type="dxa" w:w="2019"/>
             <w:tcBorders>
               <w:top w:val="single" w:color="D9D7D0" w:sz="4"/>
               <w:left w:val="single" w:color="D9D7D0" w:sz="4"/>
@@ -4143,7 +4143,7 @@
         </w:trPr>
         <w:tc>
           <w:tcPr>
-            <w:tcW w:type="dxa" w:w="5731"/>
+            <w:tcW w:type="dxa" w:w="5506"/>
             <w:tcBorders>
               <w:top w:val="single" w:color="D9D7D0" w:sz="4"/>
               <w:left w:val="single" w:color="D9D7D0" w:sz="4"/>
@@ -4173,7 +4173,7 @@
         </w:tc>
         <w:tc>
           <w:tcPr>
-            <w:tcW w:type="dxa" w:w="1719"/>
+            <w:tcW w:type="dxa" w:w="1835"/>
             <w:tcBorders>
               <w:top w:val="single" w:color="D9D7D0" w:sz="4"/>
               <w:left w:val="single" w:color="D9D7D0" w:sz="4"/>
@@ -4203,7 +4203,7 @@
         </w:tc>
         <w:tc>
           <w:tcPr>
-            <w:tcW w:type="dxa" w:w="1910"/>
+            <w:tcW w:type="dxa" w:w="2019"/>
             <w:tcBorders>
               <w:top w:val="single" w:color="D9D7D0" w:sz="4"/>
               <w:left w:val="single" w:color="D9D7D0" w:sz="4"/>
@@ -4239,7 +4239,7 @@
         </w:trPr>
         <w:tc>
           <w:tcPr>
-            <w:tcW w:type="dxa" w:w="5731"/>
+            <w:tcW w:type="dxa" w:w="5506"/>
             <w:tcBorders>
               <w:top w:val="single" w:color="D9D7D0" w:sz="4"/>
               <w:left w:val="single" w:color="D9D7D0" w:sz="4"/>
@@ -4269,7 +4269,7 @@
         </w:tc>
         <w:tc>
           <w:tcPr>
-            <w:tcW w:type="dxa" w:w="1719"/>
+            <w:tcW w:type="dxa" w:w="1835"/>
             <w:tcBorders>
               <w:top w:val="single" w:color="D9D7D0" w:sz="4"/>
               <w:left w:val="single" w:color="D9D7D0" w:sz="4"/>
@@ -4299,7 +4299,7 @@
         </w:tc>
         <w:tc>
           <w:tcPr>
-            <w:tcW w:type="dxa" w:w="1910"/>
+            <w:tcW w:type="dxa" w:w="2019"/>
             <w:tcBorders>
               <w:top w:val="single" w:color="D9D7D0" w:sz="4"/>
               <w:left w:val="single" w:color="D9D7D0" w:sz="4"/>
@@ -4335,7 +4335,7 @@
         </w:trPr>
         <w:tc>
           <w:tcPr>
-            <w:tcW w:type="dxa" w:w="5731"/>
+            <w:tcW w:type="dxa" w:w="5506"/>
             <w:tcBorders>
               <w:top w:val="single" w:color="D9D7D0" w:sz="4"/>
               <w:left w:val="single" w:color="D9D7D0" w:sz="4"/>
@@ -4365,7 +4365,7 @@
         </w:tc>
         <w:tc>
           <w:tcPr>
-            <w:tcW w:type="dxa" w:w="1719"/>
+            <w:tcW w:type="dxa" w:w="1835"/>
             <w:tcBorders>
               <w:top w:val="single" w:color="D9D7D0" w:sz="4"/>
               <w:left w:val="single" w:color="D9D7D0" w:sz="4"/>
@@ -4395,7 +4395,7 @@
         </w:tc>
         <w:tc>
           <w:tcPr>
-            <w:tcW w:type="dxa" w:w="1910"/>
+            <w:tcW w:type="dxa" w:w="2019"/>
             <w:tcBorders>
               <w:top w:val="single" w:color="D9D7D0" w:sz="4"/>
               <w:left w:val="single" w:color="D9D7D0" w:sz="4"/>
@@ -4431,7 +4431,7 @@
         </w:trPr>
         <w:tc>
           <w:tcPr>
-            <w:tcW w:type="dxa" w:w="5731"/>
+            <w:tcW w:type="dxa" w:w="5506"/>
             <w:tcBorders>
               <w:top w:val="single" w:color="D9D7D0" w:sz="4"/>
               <w:left w:val="single" w:color="D9D7D0" w:sz="4"/>
@@ -4461,7 +4461,7 @@
         </w:tc>
         <w:tc>
           <w:tcPr>
-            <w:tcW w:type="dxa" w:w="1719"/>
+            <w:tcW w:type="dxa" w:w="1835"/>
             <w:tcBorders>
               <w:top w:val="single" w:color="D9D7D0" w:sz="4"/>
               <w:left w:val="single" w:color="D9D7D0" w:sz="4"/>
@@ -4491,7 +4491,7 @@
         </w:tc>
         <w:tc>
           <w:tcPr>
-            <w:tcW w:type="dxa" w:w="1910"/>
+            <w:tcW w:type="dxa" w:w="2019"/>
             <w:tcBorders>
               <w:top w:val="single" w:color="D9D7D0" w:sz="4"/>
               <w:left w:val="single" w:color="D9D7D0" w:sz="4"/>
@@ -4527,7 +4527,7 @@
         </w:trPr>
         <w:tc>
           <w:tcPr>
-            <w:tcW w:type="dxa" w:w="5731"/>
+            <w:tcW w:type="dxa" w:w="5506"/>
             <w:tcBorders>
               <w:top w:val="single" w:color="D9D7D0" w:sz="4"/>
               <w:left w:val="single" w:color="D9D7D0" w:sz="4"/>
@@ -4560,7 +4560,7 @@
         </w:tc>
         <w:tc>
           <w:tcPr>
-            <w:tcW w:type="dxa" w:w="1719"/>
+            <w:tcW w:type="dxa" w:w="1835"/>
             <w:tcBorders>
               <w:top w:val="single" w:color="D9D7D0" w:sz="4"/>
               <w:left w:val="single" w:color="D9D7D0" w:sz="4"/>
@@ -4593,7 +4593,7 @@
         </w:tc>
         <w:tc>
           <w:tcPr>
-            <w:tcW w:type="dxa" w:w="1910"/>
+            <w:tcW w:type="dxa" w:w="2019"/>
             <w:tcBorders>
               <w:top w:val="single" w:color="D9D7D0" w:sz="4"/>
               <w:left w:val="single" w:color="D9D7D0" w:sz="4"/>
@@ -4632,7 +4632,7 @@
         </w:trPr>
         <w:tc>
           <w:tcPr>
-            <w:tcW w:type="dxa" w:w="5731"/>
+            <w:tcW w:type="dxa" w:w="5506"/>
             <w:tcBorders>
               <w:top w:val="single" w:color="D9D7D0" w:sz="4"/>
               <w:left w:val="single" w:color="D9D7D0" w:sz="4"/>
@@ -4662,7 +4662,7 @@
         </w:tc>
         <w:tc>
           <w:tcPr>
-            <w:tcW w:type="dxa" w:w="1719"/>
+            <w:tcW w:type="dxa" w:w="1835"/>
             <w:tcBorders>
               <w:top w:val="single" w:color="D9D7D0" w:sz="4"/>
               <w:left w:val="single" w:color="D9D7D0" w:sz="4"/>
@@ -4692,7 +4692,7 @@
         </w:tc>
         <w:tc>
           <w:tcPr>
-            <w:tcW w:type="dxa" w:w="1910"/>
+            <w:tcW w:type="dxa" w:w="2019"/>
             <w:tcBorders>
               <w:top w:val="single" w:color="D9D7D0" w:sz="4"/>
               <w:left w:val="single" w:color="D9D7D0" w:sz="4"/>
@@ -4728,7 +4728,7 @@
         </w:trPr>
         <w:tc>
           <w:tcPr>
-            <w:tcW w:type="dxa" w:w="5731"/>
+            <w:tcW w:type="dxa" w:w="5506"/>
             <w:tcBorders>
               <w:top w:val="single" w:color="D9D7D0" w:sz="4"/>
               <w:left w:val="single" w:color="D9D7D0" w:sz="4"/>
@@ -4758,7 +4758,7 @@
         </w:tc>
         <w:tc>
           <w:tcPr>
-            <w:tcW w:type="dxa" w:w="1719"/>
+            <w:tcW w:type="dxa" w:w="1835"/>
             <w:tcBorders>
               <w:top w:val="single" w:color="D9D7D0" w:sz="4"/>
               <w:left w:val="single" w:color="D9D7D0" w:sz="4"/>
@@ -4788,7 +4788,7 @@
         </w:tc>
         <w:tc>
           <w:tcPr>
-            <w:tcW w:type="dxa" w:w="1910"/>
+            <w:tcW w:type="dxa" w:w="2019"/>
             <w:tcBorders>
               <w:top w:val="single" w:color="D9D7D0" w:sz="4"/>
               <w:left w:val="single" w:color="D9D7D0" w:sz="4"/>
@@ -4824,7 +4824,7 @@
         </w:trPr>
         <w:tc>
           <w:tcPr>
-            <w:tcW w:type="dxa" w:w="5731"/>
+            <w:tcW w:type="dxa" w:w="5506"/>
             <w:tcBorders>
               <w:top w:val="single" w:color="D9D7D0" w:sz="4"/>
               <w:left w:val="single" w:color="D9D7D0" w:sz="4"/>
@@ -4857,7 +4857,7 @@
         </w:tc>
         <w:tc>
           <w:tcPr>
-            <w:tcW w:type="dxa" w:w="1719"/>
+            <w:tcW w:type="dxa" w:w="1835"/>
             <w:tcBorders>
               <w:top w:val="single" w:color="D9D7D0" w:sz="4"/>
               <w:left w:val="single" w:color="D9D7D0" w:sz="4"/>
@@ -4890,7 +4890,7 @@
         </w:tc>
         <w:tc>
           <w:tcPr>
-            <w:tcW w:type="dxa" w:w="1910"/>
+            <w:tcW w:type="dxa" w:w="2019"/>
             <w:tcBorders>
               <w:top w:val="single" w:color="D9D7D0" w:sz="4"/>
               <w:left w:val="single" w:color="D9D7D0" w:sz="4"/>
@@ -4929,7 +4929,7 @@
         </w:trPr>
         <w:tc>
           <w:tcPr>
-            <w:tcW w:type="dxa" w:w="5731"/>
+            <w:tcW w:type="dxa" w:w="5506"/>
             <w:tcBorders>
               <w:top w:val="single" w:color="D9D7D0" w:sz="4"/>
               <w:left w:val="single" w:color="D9D7D0" w:sz="4"/>
@@ -4959,7 +4959,7 @@
         </w:tc>
         <w:tc>
           <w:tcPr>
-            <w:tcW w:type="dxa" w:w="1719"/>
+            <w:tcW w:type="dxa" w:w="1835"/>
             <w:tcBorders>
               <w:top w:val="single" w:color="D9D7D0" w:sz="4"/>
               <w:left w:val="single" w:color="D9D7D0" w:sz="4"/>
@@ -4989,7 +4989,7 @@
         </w:tc>
         <w:tc>
           <w:tcPr>
-            <w:tcW w:type="dxa" w:w="1910"/>
+            <w:tcW w:type="dxa" w:w="2019"/>
             <w:tcBorders>
               <w:top w:val="single" w:color="D9D7D0" w:sz="4"/>
               <w:left w:val="single" w:color="D9D7D0" w:sz="4"/>
@@ -5025,7 +5025,7 @@
         </w:trPr>
         <w:tc>
           <w:tcPr>
-            <w:tcW w:type="dxa" w:w="5731"/>
+            <w:tcW w:type="dxa" w:w="5506"/>
             <w:tcBorders>
               <w:top w:val="single" w:color="D9D7D0" w:sz="4"/>
               <w:left w:val="single" w:color="D9D7D0" w:sz="4"/>
@@ -5058,7 +5058,7 @@
         </w:tc>
         <w:tc>
           <w:tcPr>
-            <w:tcW w:type="dxa" w:w="1719"/>
+            <w:tcW w:type="dxa" w:w="1835"/>
             <w:tcBorders>
               <w:top w:val="single" w:color="D9D7D0" w:sz="4"/>
               <w:left w:val="single" w:color="D9D7D0" w:sz="4"/>
@@ -5091,7 +5091,7 @@
         </w:tc>
         <w:tc>
           <w:tcPr>
-            <w:tcW w:type="dxa" w:w="1910"/>
+            <w:tcW w:type="dxa" w:w="2019"/>
             <w:tcBorders>
               <w:top w:val="single" w:color="D9D7D0" w:sz="4"/>
               <w:left w:val="single" w:color="D9D7D0" w:sz="4"/>
@@ -5130,7 +5130,7 @@
         </w:trPr>
         <w:tc>
           <w:tcPr>
-            <w:tcW w:type="dxa" w:w="5731"/>
+            <w:tcW w:type="dxa" w:w="5506"/>
             <w:tcBorders>
               <w:top w:val="single" w:color="D9D7D0" w:sz="4"/>
               <w:left w:val="single" w:color="D9D7D0" w:sz="4"/>
@@ -5160,7 +5160,7 @@
         </w:tc>
         <w:tc>
           <w:tcPr>
-            <w:tcW w:type="dxa" w:w="1719"/>
+            <w:tcW w:type="dxa" w:w="1835"/>
             <w:tcBorders>
               <w:top w:val="single" w:color="D9D7D0" w:sz="4"/>
               <w:left w:val="single" w:color="D9D7D0" w:sz="4"/>
@@ -5190,7 +5190,7 @@
         </w:tc>
         <w:tc>
           <w:tcPr>
-            <w:tcW w:type="dxa" w:w="1910"/>
+            <w:tcW w:type="dxa" w:w="2019"/>
             <w:tcBorders>
               <w:top w:val="single" w:color="D9D7D0" w:sz="4"/>
               <w:left w:val="single" w:color="D9D7D0" w:sz="4"/>
@@ -7723,7 +7723,7 @@
         </w:rPr>
         <w:t xml:space="preserve">Contact: </w:t>
       </w:r>
-      <w:hyperlink w:history="1" r:id="rId_oilikwbkxlwdjp80zbmm">
+      <w:hyperlink w:history="1" r:id="rId0sodsuls3irow49nlps-v">
         <w:r>
           <w:rPr>
             <w:rFonts w:ascii="Arial" w:cs="Arial" w:eastAsia="Arial" w:hAnsi="Arial"/>
@@ -7766,7 +7766,7 @@
         </w:rPr>
         <w:t xml:space="preserve">AI visual inspection market: ResearchAndMarkets, report 6226169 — </w:t>
       </w:r>
-      <w:hyperlink w:history="1" r:id="rId2hd-evodidtsxynfq60oz">
+      <w:hyperlink w:history="1" r:id="rId57sm4fkbkx60u8veyb5h-">
         <w:r>
           <w:rPr>
             <w:rFonts w:ascii="Arial" w:cs="Arial" w:eastAsia="Arial" w:hAnsi="Arial"/>
@@ -7792,7 +7792,7 @@
         </w:rPr>
         <w:t xml:space="preserve">Asia-Pacific machine vision: MarketsandMarkets press release — </w:t>
       </w:r>
-      <w:hyperlink w:history="1" r:id="rIdxe6dizjulaj4ipctcx7--">
+      <w:hyperlink w:history="1" r:id="rId_abqdjge9i2sivuewjcgu">
         <w:r>
           <w:rPr>
             <w:rFonts w:ascii="Arial" w:cs="Arial" w:eastAsia="Arial" w:hAnsi="Arial"/>
@@ -7818,7 +7818,7 @@
         </w:rPr>
         <w:t xml:space="preserve">Vietnam GDP and manufacturing 2025: Vietnam Briefing manufacturing tracker — </w:t>
       </w:r>
-      <w:hyperlink w:history="1" r:id="rIdsbuooetkbdqnducgzoeq1">
+      <w:hyperlink w:history="1" r:id="rIdmvv0frplgpkgcbopiuzij">
         <w:r>
           <w:rPr>
             <w:rFonts w:ascii="Arial" w:cs="Arial" w:eastAsia="Arial" w:hAnsi="Arial"/>
@@ -7844,7 +7844,7 @@
         </w:rPr>
         <w:t xml:space="preserve">Vietnam food processing: USDA FAS, Vietnam Food Processing Ingredients report 2026 — </w:t>
       </w:r>
-      <w:hyperlink w:history="1" r:id="rId_3rdy25-yzz-n2q-8egxa">
+      <w:hyperlink w:history="1" r:id="rIdm3k3_2mmjzwng687eypyx">
         <w:r>
           <w:rPr>
             <w:rFonts w:ascii="Arial" w:cs="Arial" w:eastAsia="Arial" w:hAnsi="Arial"/>
@@ -7870,7 +7870,7 @@
         </w:rPr>
         <w:t xml:space="preserve">Vietnam agro-forestry-fishery exports 2025: SGGP — </w:t>
       </w:r>
-      <w:hyperlink w:history="1" r:id="rIdscaif18uxpvvyvilip1lb">
+      <w:hyperlink w:history="1" r:id="rIdablv_citxn3wrxi0xrfrq">
         <w:r>
           <w:rPr>
             <w:rFonts w:ascii="Arial" w:cs="Arial" w:eastAsia="Arial" w:hAnsi="Arial"/>
@@ -7896,7 +7896,7 @@
         </w:rPr>
         <w:t xml:space="preserve">Canada food and beverage processing: USDA FAS, Canada Food Processing Ingredients Annual 2025 — </w:t>
       </w:r>
-      <w:hyperlink w:history="1" r:id="rIdavqy3ozrp_ccezrbziuf8">
+      <w:hyperlink w:history="1" r:id="rIdloe3ckm5mh5aj7i8rdtrh">
         <w:r>
           <w:rPr>
             <w:rFonts w:ascii="Arial" w:cs="Arial" w:eastAsia="Arial" w:hAnsi="Arial"/>
@@ -7922,7 +7922,7 @@
         </w:rPr>
         <w:t xml:space="preserve">Vietnam manufacturing wages 2025: Vietnam Briefing — </w:t>
       </w:r>
-      <w:hyperlink w:history="1" r:id="rIdhgmimr6l8vqmnogxfd9ty">
+      <w:hyperlink w:history="1" r:id="rIdj_imit5zasqpmv4fwu2wq">
         <w:r>
           <w:rPr>
             <w:rFonts w:ascii="Arial" w:cs="Arial" w:eastAsia="Arial" w:hAnsi="Arial"/>
@@ -7948,7 +7948,7 @@
         </w:rPr>
         <w:t xml:space="preserve">AI inspection system cost: averroes.ai visual inspection system cost breakdown — </w:t>
       </w:r>
-      <w:hyperlink w:history="1" r:id="rIdquhc3ijporcw1exzvpfis">
+      <w:hyperlink w:history="1" r:id="rIdniujtuncvboezjutb69xt">
         <w:r>
           <w:rPr>
             <w:rFonts w:ascii="Arial" w:cs="Arial" w:eastAsia="Arial" w:hAnsi="Arial"/>
@@ -7964,7 +7964,7 @@
         </w:rPr>
         <w:t xml:space="preserve">; iFactory pricing guide — </w:t>
       </w:r>
-      <w:hyperlink w:history="1" r:id="rIdurtm6ukxlkxo-loxftrxc">
+      <w:hyperlink w:history="1" r:id="rIddopfvanctzsladh1jzqgi">
         <w:r>
           <w:rPr>
             <w:rFonts w:ascii="Arial" w:cs="Arial" w:eastAsia="Arial" w:hAnsi="Arial"/>
@@ -8148,7 +8148,7 @@
         <w:sz w:val="16"/>
         <w:szCs w:val="16"/>
       </w:rPr>
-      <w:t xml:space="preserve">MTRobotics — MTR-Q business proposal</w:t>
+      <w:t xml:space="preserve">MTRobotics — MetriQ business proposal</w:t>
     </w:r>
   </w:p>
 </w:hdr>

</xml_diff>